<commit_message>
my real final commit
</commit_message>
<xml_diff>
--- a/El_Bahi_Task_2.docx
+++ b/El_Bahi_Task_2.docx
@@ -574,42 +574,99 @@
           <w:sz w:val="24"/>
           <w:szCs w:val="28"/>
         </w:rPr>
-        <w:t>The program is original, runs successfully in my testing, and delivers all 40 packages while staying under the 140-mile limit. Based on the completed run that I included in the screenshots</w:t>
-      </w:r>
+        <w:t xml:space="preserve">The program runs successfully in my </w:t>
+      </w:r>
+      <w:proofErr w:type="gramStart"/>
       <w:r>
         <w:rPr>
           <w:rFonts w:ascii="Arial" w:hAnsi="Arial" w:cs="Arial"/>
           <w:sz w:val="24"/>
           <w:szCs w:val="28"/>
         </w:rPr>
-        <w:t xml:space="preserve"> (D section)</w:t>
-      </w:r>
+        <w:t>testing, and</w:t>
+      </w:r>
+      <w:proofErr w:type="gramEnd"/>
       <w:r>
         <w:rPr>
           <w:rFonts w:ascii="Arial" w:hAnsi="Arial" w:cs="Arial"/>
           <w:sz w:val="24"/>
           <w:szCs w:val="28"/>
         </w:rPr>
+        <w:t xml:space="preserve"> delivers all 40 packages while staying under the 140-mile limit. Based on the completed run that I included in the screenshots</w:t>
+      </w:r>
+      <w:r>
+        <w:rPr>
+          <w:rFonts w:ascii="Arial" w:hAnsi="Arial" w:cs="Arial"/>
+          <w:sz w:val="24"/>
+          <w:szCs w:val="28"/>
+        </w:rPr>
+        <w:t xml:space="preserve"> (D section)</w:t>
+      </w:r>
+      <w:r>
+        <w:rPr>
+          <w:rFonts w:ascii="Arial" w:hAnsi="Arial" w:cs="Arial"/>
+          <w:sz w:val="24"/>
+          <w:szCs w:val="28"/>
+        </w:rPr>
         <w:t>, the combined distance traveled by all trucks is about 122.00 miles.</w:t>
       </w:r>
     </w:p>
     <w:p>
       <w:pPr>
-        <w:pStyle w:val="Heading2"/>
-        <w:rPr>
-          <w:rFonts w:ascii="Arial" w:hAnsi="Arial" w:cs="Arial"/>
-        </w:rPr>
-      </w:pPr>
-      <w:r>
-        <w:rPr>
-          <w:rFonts w:ascii="Arial" w:hAnsi="Arial" w:cs="Arial"/>
-          <w:color w:val="2F5496"/>
-        </w:rPr>
-        <w:t>C2. Process and Flow Comments</w:t>
-      </w:r>
+        <w:spacing w:after="120" w:line="259" w:lineRule="auto"/>
+        <w:rPr>
+          <w:rFonts w:ascii="Arial" w:hAnsi="Arial" w:cs="Arial"/>
+          <w:sz w:val="24"/>
+          <w:szCs w:val="28"/>
+        </w:rPr>
+      </w:pPr>
+      <w:hyperlink r:id="rId7" w:history="1">
+        <w:r>
+          <w:rPr>
+            <w:rStyle w:val="Hyperlink"/>
+            <w:rFonts w:ascii="Arial" w:hAnsi="Arial" w:cs="Arial"/>
+            <w:sz w:val="24"/>
+            <w:szCs w:val="28"/>
+          </w:rPr>
+          <w:t>GITH</w:t>
+        </w:r>
+        <w:r>
+          <w:rPr>
+            <w:rStyle w:val="Hyperlink"/>
+            <w:rFonts w:ascii="Arial" w:hAnsi="Arial" w:cs="Arial"/>
+            <w:sz w:val="24"/>
+            <w:szCs w:val="28"/>
+          </w:rPr>
+          <w:t>U</w:t>
+        </w:r>
+        <w:r>
+          <w:rPr>
+            <w:rStyle w:val="Hyperlink"/>
+            <w:rFonts w:ascii="Arial" w:hAnsi="Arial" w:cs="Arial"/>
+            <w:sz w:val="24"/>
+            <w:szCs w:val="28"/>
+          </w:rPr>
+          <w:t>B</w:t>
+        </w:r>
+      </w:hyperlink>
     </w:p>
     <w:p>
       <w:pPr>
+        <w:pStyle w:val="Heading2"/>
+        <w:rPr>
+          <w:rFonts w:ascii="Arial" w:hAnsi="Arial" w:cs="Arial"/>
+        </w:rPr>
+      </w:pPr>
+      <w:r>
+        <w:rPr>
+          <w:rFonts w:ascii="Arial" w:hAnsi="Arial" w:cs="Arial"/>
+          <w:color w:val="2F5496"/>
+        </w:rPr>
+        <w:t>C2. Process and Flow Comments</w:t>
+      </w:r>
+    </w:p>
+    <w:p>
+      <w:pPr>
         <w:spacing w:after="120" w:line="259" w:lineRule="auto"/>
         <w:rPr>
           <w:rFonts w:ascii="Arial" w:hAnsi="Arial" w:cs="Arial"/>
@@ -896,7 +953,16 @@
           <w:sz w:val="24"/>
           <w:szCs w:val="28"/>
         </w:rPr>
-        <w:t>. When the user chooses the single-package option, the program prints a detailed view for one package with the same required information. The mileage option shows each truck's miles and the overall total.</w:t>
+        <w:t xml:space="preserve">. When the user chooses the single-package option, the </w:t>
+      </w:r>
+      <w:r>
+        <w:rPr>
+          <w:rFonts w:ascii="Arial" w:hAnsi="Arial" w:cs="Arial"/>
+          <w:sz w:val="24"/>
+          <w:szCs w:val="28"/>
+        </w:rPr>
+        <w:lastRenderedPageBreak/>
+        <w:t>program prints a detailed view for one package with the same required information. The mileage option shows each truck's miles and the overall total.</w:t>
       </w:r>
     </w:p>
     <w:p>
@@ -911,7 +977,6 @@
           <w:rFonts w:ascii="Arial" w:hAnsi="Arial" w:cs="Arial"/>
           <w:noProof/>
         </w:rPr>
-        <w:lastRenderedPageBreak/>
         <w:drawing>
           <wp:inline distT="0" distB="0" distL="0" distR="0" wp14:anchorId="33B0ECF6" wp14:editId="4870CD63">
             <wp:extent cx="6371070" cy="3383280"/>
@@ -928,7 +993,7 @@
                     <pic:cNvPicPr/>
                   </pic:nvPicPr>
                   <pic:blipFill>
-                    <a:blip r:embed="rId7"/>
+                    <a:blip r:embed="rId8"/>
                     <a:stretch>
                       <a:fillRect/>
                     </a:stretch>
@@ -1026,7 +1091,7 @@
                     <pic:cNvPicPr/>
                   </pic:nvPicPr>
                   <pic:blipFill>
-                    <a:blip r:embed="rId8"/>
+                    <a:blip r:embed="rId9"/>
                     <a:stretch>
                       <a:fillRect/>
                     </a:stretch>
@@ -1060,6 +1125,7 @@
           <w:i/>
           <w:sz w:val="18"/>
         </w:rPr>
+        <w:lastRenderedPageBreak/>
         <w:t>Figure 3. Status of packages at a time between 8:35 a.m. and 9:25 a.m.</w:t>
       </w:r>
     </w:p>
@@ -1075,7 +1141,6 @@
           <w:rFonts w:ascii="Arial" w:hAnsi="Arial" w:cs="Arial"/>
           <w:color w:val="2F5496"/>
         </w:rPr>
-        <w:lastRenderedPageBreak/>
         <w:t>D2. Second Status Check</w:t>
       </w:r>
     </w:p>
@@ -1125,7 +1190,7 @@
                     <pic:cNvPicPr/>
                   </pic:nvPicPr>
                   <pic:blipFill>
-                    <a:blip r:embed="rId9"/>
+                    <a:blip r:embed="rId10"/>
                     <a:stretch>
                       <a:fillRect/>
                     </a:stretch>
@@ -1207,6 +1272,7 @@
           <w:rFonts w:ascii="Arial" w:hAnsi="Arial" w:cs="Arial"/>
           <w:noProof/>
         </w:rPr>
+        <w:lastRenderedPageBreak/>
         <w:drawing>
           <wp:inline distT="0" distB="0" distL="0" distR="0" wp14:anchorId="0B7D27FC" wp14:editId="0054EFA4">
             <wp:extent cx="6336623" cy="3383280"/>
@@ -1223,7 +1289,7 @@
                     <pic:cNvPicPr/>
                   </pic:nvPicPr>
                   <pic:blipFill>
-                    <a:blip r:embed="rId10"/>
+                    <a:blip r:embed="rId11"/>
                     <a:stretch>
                       <a:fillRect/>
                     </a:stretch>
@@ -1257,7 +1323,6 @@
           <w:i/>
           <w:sz w:val="18"/>
         </w:rPr>
-        <w:lastRenderedPageBreak/>
         <w:t>Figure 5. Status of packages at a time between 12:03 p.m. and 1:12 p.m.</w:t>
       </w:r>
     </w:p>
@@ -1322,7 +1387,7 @@
                     <pic:cNvPicPr/>
                   </pic:nvPicPr>
                   <pic:blipFill>
-                    <a:blip r:embed="rId11"/>
+                    <a:blip r:embed="rId12"/>
                     <a:stretch>
                       <a:fillRect/>
                     </a:stretch>
@@ -1371,6 +1436,7 @@
           <w:rFonts w:ascii="Arial" w:hAnsi="Arial" w:cs="Arial"/>
           <w:color w:val="1F4E79"/>
         </w:rPr>
+        <w:lastRenderedPageBreak/>
         <w:t>F. Algorithm Justification</w:t>
       </w:r>
     </w:p>
@@ -1489,7 +1555,6 @@
           <w:rFonts w:ascii="Arial" w:hAnsi="Arial" w:cs="Arial"/>
           <w:color w:val="2F5496"/>
         </w:rPr>
-        <w:lastRenderedPageBreak/>
         <w:t>F2. Verification That the Algorithm Meets the Scenario Requirements</w:t>
       </w:r>
     </w:p>
@@ -1661,6 +1726,7 @@
           <w:sz w:val="24"/>
           <w:szCs w:val="28"/>
         </w:rPr>
+        <w:lastRenderedPageBreak/>
         <w:t>The 2-opt algorithm is also different from my solution. Nearest neighbor builds one route forward and keeps going until all stops are assigned. In contrast, 2-opt starts with an existing route and then improves it by swapping route segments to reduce total distance. In other words, nearest neighbor constructs the route, while 2-opt is more of a route-improvement method.</w:t>
       </w:r>
     </w:p>
@@ -1761,7 +1827,6 @@
           <w:rFonts w:ascii="Arial" w:hAnsi="Arial" w:cs="Arial"/>
           <w:color w:val="1F4E79"/>
         </w:rPr>
-        <w:lastRenderedPageBreak/>
         <w:t>H. Verification of the Data Structure</w:t>
       </w:r>
     </w:p>
@@ -1796,27 +1861,44 @@
           <w:sz w:val="24"/>
           <w:szCs w:val="28"/>
         </w:rPr>
-        <w:t xml:space="preserve">The table stores all 40 packages without any collisions causing data loss. Status updates during the simulation are reflected automatically because the Package object is stored by reference, so changes made during delivery are immediately visible in later </w:t>
-      </w:r>
-      <w:r>
+        <w:t>The table stores all 40 packages without any collisions causing data loss. Status updates during the simulation are reflected automatically because the Package object is stored by reference, so changes made during delivery are immediately visible in later look-up calls.</w:t>
+      </w:r>
+    </w:p>
+    <w:p>
+      <w:pPr>
+        <w:spacing w:after="120" w:line="259" w:lineRule="auto"/>
         <w:rPr>
           <w:rFonts w:ascii="Arial" w:hAnsi="Arial" w:cs="Arial"/>
           <w:sz w:val="24"/>
           <w:szCs w:val="28"/>
         </w:rPr>
-        <w:t>look-up</w:t>
-      </w:r>
+      </w:pPr>
       <w:r>
         <w:rPr>
           <w:rFonts w:ascii="Arial" w:hAnsi="Arial" w:cs="Arial"/>
           <w:sz w:val="24"/>
           <w:szCs w:val="28"/>
         </w:rPr>
-        <w:t xml:space="preserve"> calls.</w:t>
+        <w:t>The structure also supports updates naturally. When a package status changes from At Hub to En route or Delivered, the package object stored in the hash table reflects that change. That means the program does not need to rebuild the table every time a status changes.</w:t>
       </w:r>
     </w:p>
     <w:p>
       <w:pPr>
+        <w:pStyle w:val="Heading2"/>
+        <w:rPr>
+          <w:rFonts w:ascii="Arial" w:hAnsi="Arial" w:cs="Arial"/>
+        </w:rPr>
+      </w:pPr>
+      <w:r>
+        <w:rPr>
+          <w:rFonts w:ascii="Arial" w:hAnsi="Arial" w:cs="Arial"/>
+          <w:color w:val="2F5496"/>
+        </w:rPr>
+        <w:t>H1. Two Other Data Structures</w:t>
+      </w:r>
+    </w:p>
+    <w:p>
+      <w:pPr>
         <w:spacing w:after="120" w:line="259" w:lineRule="auto"/>
         <w:rPr>
           <w:rFonts w:ascii="Arial" w:hAnsi="Arial" w:cs="Arial"/>
@@ -1830,7 +1912,7 @@
           <w:sz w:val="24"/>
           <w:szCs w:val="28"/>
         </w:rPr>
-        <w:t>The structure also supports updates naturally. When a package status changes from At Hub to En route or Delivered, the package object stored in the hash table reflects that change. That means the program does not need to rebuild the table every time a status changes.</w:t>
+        <w:t>Two other data structures that could meet the same requirements are a direct-address table and a binary search tree.</w:t>
       </w:r>
     </w:p>
     <w:p>
@@ -1845,7 +1927,7 @@
           <w:rFonts w:ascii="Arial" w:hAnsi="Arial" w:cs="Arial"/>
           <w:color w:val="2F5496"/>
         </w:rPr>
-        <w:t>H1. Two Other Data Structures</w:t>
+        <w:t>H1a. How Those Data Structures Are Different From My Solution</w:t>
       </w:r>
     </w:p>
     <w:p>
@@ -1863,62 +1945,29 @@
           <w:sz w:val="24"/>
           <w:szCs w:val="28"/>
         </w:rPr>
-        <w:t>Two other data structures that could meet the same requirements are a direct-address table and a binary search tree.</w:t>
+        <w:t>A direct-address table would store each package in a list position that matches the package ID. That would make lookup very fast, but it only works well when the keys stay in a small known range. My hash table is more flexible because it can still map keys into a smaller structure through hashing.</w:t>
       </w:r>
     </w:p>
     <w:p>
       <w:pPr>
-        <w:pStyle w:val="Heading2"/>
-        <w:rPr>
-          <w:rFonts w:ascii="Arial" w:hAnsi="Arial" w:cs="Arial"/>
-        </w:rPr>
-      </w:pPr>
-      <w:r>
-        <w:rPr>
-          <w:rFonts w:ascii="Arial" w:hAnsi="Arial" w:cs="Arial"/>
-          <w:color w:val="2F5496"/>
-        </w:rPr>
-        <w:t>H1a. How Those Data Structures Are Different From My Solution</w:t>
+        <w:spacing w:after="120" w:line="259" w:lineRule="auto"/>
+        <w:rPr>
+          <w:rFonts w:ascii="Arial" w:hAnsi="Arial" w:cs="Arial"/>
+          <w:sz w:val="24"/>
+          <w:szCs w:val="28"/>
+        </w:rPr>
+      </w:pPr>
+      <w:r>
+        <w:rPr>
+          <w:rFonts w:ascii="Arial" w:hAnsi="Arial" w:cs="Arial"/>
+          <w:sz w:val="24"/>
+          <w:szCs w:val="28"/>
+        </w:rPr>
+        <w:t>A binary search tree is different because it organizes data in a sorted tree structure instead of buckets. A balanced binary search tree would allow efficient lookup and also make sorted traversal easier. My hash table is usually faster for direct lookups, but it does not naturally keep the keys in order.</w:t>
       </w:r>
     </w:p>
     <w:p>
       <w:pPr>
-        <w:spacing w:after="120" w:line="259" w:lineRule="auto"/>
-        <w:rPr>
-          <w:rFonts w:ascii="Arial" w:hAnsi="Arial" w:cs="Arial"/>
-          <w:sz w:val="24"/>
-          <w:szCs w:val="28"/>
-        </w:rPr>
-      </w:pPr>
-      <w:r>
-        <w:rPr>
-          <w:rFonts w:ascii="Arial" w:hAnsi="Arial" w:cs="Arial"/>
-          <w:sz w:val="24"/>
-          <w:szCs w:val="28"/>
-        </w:rPr>
-        <w:t>A direct-address table would store each package in a list position that matches the package ID. That would make lookup very fast, but it only works well when the keys stay in a small known range. My hash table is more flexible because it can still map keys into a smaller structure through hashing.</w:t>
-      </w:r>
-    </w:p>
-    <w:p>
-      <w:pPr>
-        <w:spacing w:after="120" w:line="259" w:lineRule="auto"/>
-        <w:rPr>
-          <w:rFonts w:ascii="Arial" w:hAnsi="Arial" w:cs="Arial"/>
-          <w:sz w:val="24"/>
-          <w:szCs w:val="28"/>
-        </w:rPr>
-      </w:pPr>
-      <w:r>
-        <w:rPr>
-          <w:rFonts w:ascii="Arial" w:hAnsi="Arial" w:cs="Arial"/>
-          <w:sz w:val="24"/>
-          <w:szCs w:val="28"/>
-        </w:rPr>
-        <w:t>A binary search tree is different because it organizes data in a sorted tree structure instead of buckets. A balanced binary search tree would allow efficient lookup and also make sorted traversal easier. My hash table is usually faster for direct lookups, but it does not naturally keep the keys in order.</w:t>
-      </w:r>
-    </w:p>
-    <w:p>
-      <w:pPr>
         <w:pStyle w:val="Heading1"/>
         <w:rPr>
           <w:rFonts w:ascii="Arial" w:hAnsi="Arial" w:cs="Arial"/>
@@ -1929,6 +1978,7 @@
           <w:rFonts w:ascii="Arial" w:hAnsi="Arial" w:cs="Arial"/>
           <w:color w:val="1F4E79"/>
         </w:rPr>
+        <w:lastRenderedPageBreak/>
         <w:t>I. Sources</w:t>
       </w:r>
     </w:p>
@@ -2810,6 +2860,7 @@
   <w:style w:type="character" w:default="1" w:styleId="DefaultParagraphFont">
     <w:name w:val="Default Paragraph Font"/>
     <w:uiPriority w:val="1"/>
+    <w:semiHidden/>
     <w:unhideWhenUsed/>
   </w:style>
   <w:style w:type="table" w:default="1" w:styleId="TableNormal">
@@ -13585,6 +13636,41 @@
         <w:shd w:val="clear" w:color="auto" w:fill="FBCAA2" w:themeFill="accent6" w:themeFillTint="7F"/>
       </w:tcPr>
     </w:tblStylePr>
+  </w:style>
+  <w:style w:type="character" w:styleId="Hyperlink">
+    <w:name w:val="Hyperlink"/>
+    <w:basedOn w:val="DefaultParagraphFont"/>
+    <w:uiPriority w:val="99"/>
+    <w:unhideWhenUsed/>
+    <w:rsid w:val="008F68E9"/>
+    <w:rPr>
+      <w:color w:val="0000FF" w:themeColor="hyperlink"/>
+      <w:u w:val="single"/>
+    </w:rPr>
+  </w:style>
+  <w:style w:type="character" w:styleId="UnresolvedMention">
+    <w:name w:val="Unresolved Mention"/>
+    <w:basedOn w:val="DefaultParagraphFont"/>
+    <w:uiPriority w:val="99"/>
+    <w:semiHidden/>
+    <w:unhideWhenUsed/>
+    <w:rsid w:val="008F68E9"/>
+    <w:rPr>
+      <w:color w:val="605E5C"/>
+      <w:shd w:val="clear" w:color="auto" w:fill="E1DFDD"/>
+    </w:rPr>
+  </w:style>
+  <w:style w:type="character" w:styleId="FollowedHyperlink">
+    <w:name w:val="FollowedHyperlink"/>
+    <w:basedOn w:val="DefaultParagraphFont"/>
+    <w:uiPriority w:val="99"/>
+    <w:semiHidden/>
+    <w:unhideWhenUsed/>
+    <w:rsid w:val="008F68E9"/>
+    <w:rPr>
+      <w:color w:val="800080" w:themeColor="followedHyperlink"/>
+      <w:u w:val="single"/>
+    </w:rPr>
   </w:style>
 </w:styles>
 </file>

</xml_diff>